<commit_message>
docs(thesis): incorporar resultados gemma:latest al análisis N=120
- gemma:latest (9B) validó la hipótesis: F1 mejoró +12.0%
- Tabla 5.6.5 actualizada con promedios corregidos
- DOCX regenerado
</commit_message>
<xml_diff>
--- a/doc/organized/Hito_5_Tarea4_Informe_Final/2026-07-04_Borrador-Informe-Final-Tesina.docx
+++ b/doc/organized/Hito_5_Tarea4_Informe_Final/2026-07-04_Borrador-Informe-Final-Tesina.docx
@@ -9501,7 +9501,7 @@
           <w:b/>
           <w:bCs/>
         </w:rPr>
-        <w:t xml:space="preserve">Benchmark completo (N=120 artículos, 4 modelos,</w:t>
+        <w:t xml:space="preserve">Benchmark completo (N=120 artículos, 5 modelos,</w:t>
       </w:r>
       <w:r>
         <w:rPr>
@@ -9784,6 +9784,99 @@
               <w:rPr>
                 <w:rStyle w:val="VerbatimChar"/>
               </w:rPr>
+              <w:t xml:space="preserve">gemma:latest</w:t>
+            </w:r>
+          </w:p>
+        </w:tc>
+        <w:tc>
+          <w:tcPr/>
+          <w:p>
+            <w:pPr>
+              <w:pStyle w:val="Compact"/>
+              <w:jc w:val="center"/>
+            </w:pPr>
+            <w:r>
+              <w:t xml:space="preserve">0.4734</w:t>
+            </w:r>
+          </w:p>
+        </w:tc>
+        <w:tc>
+          <w:tcPr/>
+          <w:p>
+            <w:pPr>
+              <w:pStyle w:val="Compact"/>
+              <w:jc w:val="center"/>
+            </w:pPr>
+            <w:r>
+              <w:rPr>
+                <w:b/>
+                <w:bCs/>
+              </w:rPr>
+              <w:t xml:space="preserve">0.5303</w:t>
+            </w:r>
+          </w:p>
+        </w:tc>
+        <w:tc>
+          <w:tcPr/>
+          <w:p>
+            <w:pPr>
+              <w:pStyle w:val="Compact"/>
+              <w:jc w:val="center"/>
+            </w:pPr>
+            <w:r>
+              <w:rPr>
+                <w:b/>
+                <w:bCs/>
+              </w:rPr>
+              <w:t xml:space="preserve">+0.0569</w:t>
+            </w:r>
+          </w:p>
+        </w:tc>
+        <w:tc>
+          <w:tcPr/>
+          <w:p>
+            <w:pPr>
+              <w:pStyle w:val="Compact"/>
+              <w:jc w:val="center"/>
+            </w:pPr>
+            <w:r>
+              <w:rPr>
+                <w:b/>
+                <w:bCs/>
+              </w:rPr>
+              <w:t xml:space="preserve">+12.0%</w:t>
+            </w:r>
+          </w:p>
+        </w:tc>
+        <w:tc>
+          <w:tcPr/>
+          <w:p>
+            <w:pPr>
+              <w:pStyle w:val="Compact"/>
+              <w:jc w:val="center"/>
+            </w:pPr>
+            <w:r>
+              <w:rPr>
+                <w:b/>
+                <w:bCs/>
+              </w:rPr>
+              <w:t xml:space="preserve">+0.117</w:t>
+            </w:r>
+          </w:p>
+        </w:tc>
+      </w:tr>
+      <w:tr>
+        <w:tc>
+          <w:tcPr/>
+          <w:p>
+            <w:pPr>
+              <w:pStyle w:val="Compact"/>
+              <w:jc w:val="left"/>
+            </w:pPr>
+            <w:r>
+              <w:rPr>
+                <w:rStyle w:val="VerbatimChar"/>
+              </w:rPr>
               <w:t xml:space="preserve">llama3.2:latest</w:t>
             </w:r>
           </w:p>
@@ -9983,7 +10076,7 @@
               <w:jc w:val="center"/>
             </w:pPr>
             <w:r>
-              <w:t xml:space="preserve">0.5162</w:t>
+              <w:t xml:space="preserve">0.5077</w:t>
             </w:r>
           </w:p>
         </w:tc>
@@ -9999,7 +10092,7 @@
                 <w:b/>
                 <w:bCs/>
               </w:rPr>
-              <w:t xml:space="preserve">0.5515</w:t>
+              <w:t xml:space="preserve">0.5472</w:t>
             </w:r>
           </w:p>
         </w:tc>
@@ -10015,7 +10108,7 @@
                 <w:b/>
                 <w:bCs/>
               </w:rPr>
-              <w:t xml:space="preserve">+0.0352</w:t>
+              <w:t xml:space="preserve">+0.0396</w:t>
             </w:r>
           </w:p>
         </w:tc>
@@ -10031,7 +10124,7 @@
                 <w:b/>
                 <w:bCs/>
               </w:rPr>
-              <w:t xml:space="preserve">+8.3%</w:t>
+              <w:t xml:space="preserve">+9.1%</w:t>
             </w:r>
           </w:p>
         </w:tc>
@@ -10047,7 +10140,7 @@
                 <w:b/>
                 <w:bCs/>
               </w:rPr>
-              <w:t xml:space="preserve">+0.046</w:t>
+              <w:t xml:space="preserve">+0.060</w:t>
             </w:r>
           </w:p>
         </w:tc>
@@ -10257,13 +10350,28 @@
         <w:rPr>
           <w:rStyle w:val="VerbatimChar"/>
         </w:rPr>
+        <w:t xml:space="preserve">gemma:latest</w:t>
+      </w:r>
+      <w:r>
+        <w:t xml:space="preserve"> </w:t>
+      </w:r>
+      <w:r>
+        <w:t xml:space="preserve">9B,</w:t>
+      </w:r>
+      <w:r>
+        <w:t xml:space="preserve"> </w:t>
+      </w:r>
+      <w:r>
+        <w:rPr>
+          <w:rStyle w:val="VerbatimChar"/>
+        </w:rPr>
         <w:t xml:space="preserve">qwen2.5:14b</w:t>
       </w:r>
       <w:r>
         <w:t xml:space="preserve"> </w:t>
       </w:r>
       <w:r>
-        <w:t xml:space="preserve">14B): el KB RAG produce mejoras sustanciales (+25.3% y +8.9% respectivamente). Para estos modelos, las guías tipológicas actúan como</w:t>
+        <w:t xml:space="preserve">14B): el KB RAG produce mejoras sustanciales (+25.3%, +12.0% y +8.9% respectivamente). Para estos modelos, las guías tipológicas actúan como</w:t>
       </w:r>
       <w:r>
         <w:t xml:space="preserve"> </w:t>

</xml_diff>